<commit_message>
feat: add complete 100% English HUST Project I report in LaTeX and Word formats
</commit_message>
<xml_diff>
--- a/report/Project_I_Report_HUST_v2.docx
+++ b/report/Project_I_Report_HUST_v2.docx
@@ -35,7 +35,7 @@
       <w:r>
         <w:drawing>
           <wp:inline xmlns:a="http://schemas.openxmlformats.org/drawingml/2006/main" xmlns:pic="http://schemas.openxmlformats.org/drawingml/2006/picture">
-            <wp:extent cx="1371600" cy="1913709"/>
+            <wp:extent cx="1371600" cy="2055755"/>
             <wp:docPr id="1" name="Picture 1"/>
             <wp:cNvGraphicFramePr>
               <a:graphicFrameLocks noChangeAspect="1"/>
@@ -56,7 +56,7 @@
                   <pic:spPr>
                     <a:xfrm>
                       <a:off x="0" y="0"/>
-                      <a:ext cx="1371600" cy="1913709"/>
+                      <a:ext cx="1371600" cy="2055755"/>
                     </a:xfrm>
                     <a:prstGeom prst="rect"/>
                   </pic:spPr>

</xml_diff>